<commit_message>
feat: scaffold Express + TS backed with routes, middleware, and controllers
</commit_message>
<xml_diff>
--- a/Folio 28-day plan.docx
+++ b/Folio 28-day plan.docx
@@ -1,6 +1,6 @@
 
 <file path=word/document.xml><?xml version="1.0" encoding="utf-8"?>
-<w:document xmlns:wpc="http://schemas.microsoft.com/office/word/2010/wordprocessingCanvas" xmlns:cx="http://schemas.microsoft.com/office/drawing/2014/chartex" xmlns:cx1="http://schemas.microsoft.com/office/drawing/2015/9/8/chartex" xmlns:cx2="http://schemas.microsoft.com/office/drawing/2015/10/21/chartex" xmlns:cx3="http://schemas.microsoft.com/office/drawing/2016/5/9/chartex" xmlns:cx4="http://schemas.microsoft.com/office/drawing/2016/5/10/chartex" xmlns:cx5="http://schemas.microsoft.com/office/drawing/2016/5/11/chartex" xmlns:cx6="http://schemas.microsoft.com/office/drawing/2016/5/12/chartex" xmlns:cx7="http://schemas.microsoft.com/office/drawing/2016/5/13/chartex" xmlns:cx8="http://schemas.microsoft.com/office/drawing/2016/5/14/chartex" xmlns:mc="http://schemas.openxmlformats.org/markup-compatibility/2006" xmlns:aink="http://schemas.microsoft.com/office/drawing/2016/ink" xmlns:am3d="http://schemas.microsoft.com/office/drawing/2017/model3d" xmlns:o="urn:schemas-microsoft-com:office:office" xmlns:oel="http://schemas.microsoft.com/office/2019/extlst" xmlns:r="http://schemas.openxmlformats.org/officeDocument/2006/relationships" xmlns:m="http://schemas.openxmlformats.org/officeDocument/2006/math" xmlns:v="urn:schemas-microsoft-com:vml" xmlns:wp14="http://schemas.microsoft.com/office/word/2010/wordprocessingDrawing" xmlns:wp="http://schemas.openxmlformats.org/drawingml/2006/wordprocessingDrawing" xmlns:w10="urn:schemas-microsoft-com:office:word" xmlns:w="http://schemas.openxmlformats.org/wordprocessingml/2006/main" xmlns:w14="http://schemas.microsoft.com/office/word/2010/wordml" xmlns:w15="http://schemas.microsoft.com/office/word/2012/wordml" xmlns:w16cex="http://schemas.microsoft.com/office/word/2018/wordml/cex" xmlns:w16cid="http://schemas.microsoft.com/office/word/2016/wordml/cid" xmlns:w16="http://schemas.microsoft.com/office/word/2018/wordml" xmlns:w16du="http://schemas.microsoft.com/office/word/2023/wordml/word16du" xmlns:w16sdtdh="http://schemas.microsoft.com/office/word/2020/wordml/sdtdatahash" xmlns:w16sdtfl="http://schemas.microsoft.com/office/word/2024/wordml/sdtformatlock" xmlns:w16se="http://schemas.microsoft.com/office/word/2015/wordml/symex" xmlns:wpg="http://schemas.microsoft.com/office/word/2010/wordprocessingGroup" xmlns:wpi="http://schemas.microsoft.com/office/word/2010/wordprocessingInk" xmlns:wne="http://schemas.microsoft.com/office/word/2006/wordml" xmlns:wps="http://schemas.microsoft.com/office/word/2010/wordprocessingShape" mc:Ignorable="w14 w15 w16se w16cid w16 w16cex w16sdtdh w16sdtfl w16du wp14">
+<w:document xmlns:wpc="http://schemas.microsoft.com/office/word/2010/wordprocessingCanvas" xmlns:cx="http://schemas.microsoft.com/office/drawing/2014/chartex" xmlns:cx1="http://schemas.microsoft.com/office/drawing/2015/9/8/chartex" xmlns:cx2="http://schemas.microsoft.com/office/drawing/2015/10/21/chartex" xmlns:cx3="http://schemas.microsoft.com/office/drawing/2016/5/9/chartex" xmlns:cx4="http://schemas.microsoft.com/office/drawing/2016/5/10/chartex" xmlns:cx5="http://schemas.microsoft.com/office/drawing/2016/5/11/chartex" xmlns:cx6="http://schemas.microsoft.com/office/drawing/2016/5/12/chartex" xmlns:cx7="http://schemas.microsoft.com/office/drawing/2016/5/13/chartex" xmlns:cx8="http://schemas.microsoft.com/office/drawing/2016/5/14/chartex" xmlns:mc="http://schemas.openxmlformats.org/markup-compatibility/2006" xmlns:aink="http://schemas.microsoft.com/office/drawing/2016/ink" xmlns:am3d="http://schemas.microsoft.com/office/drawing/2017/model3d" xmlns:o="urn:schemas-microsoft-com:office:office" xmlns:oel="http://schemas.microsoft.com/office/2019/extlst" xmlns:r="http://schemas.openxmlformats.org/officeDocument/2006/relationships" xmlns:m="http://schemas.openxmlformats.org/officeDocument/2006/math" xmlns:v="urn:schemas-microsoft-com:vml" xmlns:wp14="http://schemas.microsoft.com/office/word/2010/wordprocessingDrawing" xmlns:wp="http://schemas.openxmlformats.org/drawingml/2006/wordprocessingDrawing" xmlns:w10="urn:schemas-microsoft-com:office:word" xmlns:w="http://schemas.openxmlformats.org/wordprocessingml/2006/main" xmlns:w14="http://schemas.microsoft.com/office/word/2010/wordml" xmlns:w15="http://schemas.microsoft.com/office/word/2012/wordml" xmlns:w16cex="http://schemas.microsoft.com/office/word/2018/wordml/cex" xmlns:w16cid="http://schemas.microsoft.com/office/word/2016/wordml/cid" xmlns:w16="http://schemas.microsoft.com/office/word/2018/wordml" xmlns:w16du="http://schemas.microsoft.com/office/word/2023/wordml/word16du" xmlns:w16sdtdh="http://schemas.microsoft.com/office/word/2020/wordml/sdtdatahash" xmlns:w16se="http://schemas.microsoft.com/office/word/2015/wordml/symex" xmlns:wpg="http://schemas.microsoft.com/office/word/2010/wordprocessingGroup" xmlns:wpi="http://schemas.microsoft.com/office/word/2010/wordprocessingInk" xmlns:wne="http://schemas.microsoft.com/office/word/2006/wordml" xmlns:wps="http://schemas.microsoft.com/office/word/2010/wordprocessingShape" mc:Ignorable="w14 w15 w16se w16cid w16 w16cex w16sdtdh w16du wp14">
   <w:body>
     <w:p>
       <w:pPr>
@@ -509,25 +509,7 @@
                 <w:sz w:val="20"/>
                 <w:szCs w:val="20"/>
               </w:rPr>
-              <w:t xml:space="preserve">Global design system — index.css, CSS </w:t>
-            </w:r>
-            <w:proofErr w:type="gramStart"/>
-            <w:r>
-              <w:rPr>
-                <w:rFonts w:ascii="Abadi" w:hAnsi="Abadi"/>
-                <w:sz w:val="20"/>
-                <w:szCs w:val="20"/>
-              </w:rPr>
-              <w:t>variables, @</w:t>
-            </w:r>
-            <w:proofErr w:type="gramEnd"/>
-            <w:r>
-              <w:rPr>
-                <w:rFonts w:ascii="Abadi" w:hAnsi="Abadi"/>
-                <w:sz w:val="20"/>
-                <w:szCs w:val="20"/>
-              </w:rPr>
-              <w:t xml:space="preserve">theme, utilities </w:t>
+              <w:t xml:space="preserve">Global design system — index.css, CSS variables, @theme, utilities </w:t>
             </w:r>
             <w:r>
               <w:rPr>
@@ -1210,25 +1192,7 @@
                 <w:sz w:val="20"/>
                 <w:szCs w:val="20"/>
               </w:rPr>
-              <w:t>()</w:t>
-            </w:r>
-            <w:proofErr w:type="gramStart"/>
-            <w:r>
-              <w:rPr>
-                <w:rFonts w:ascii="Abadi" w:hAnsi="Abadi"/>
-                <w:sz w:val="20"/>
-                <w:szCs w:val="20"/>
-              </w:rPr>
-              <w:t>, .filter</w:t>
-            </w:r>
-            <w:proofErr w:type="gramEnd"/>
-            <w:r>
-              <w:rPr>
-                <w:rFonts w:ascii="Abadi" w:hAnsi="Abadi"/>
-                <w:sz w:val="20"/>
-                <w:szCs w:val="20"/>
-              </w:rPr>
-              <w:t>(), counter animation</w:t>
+              <w:t>(), .filter(), counter animation</w:t>
             </w:r>
           </w:p>
         </w:tc>
@@ -1631,25 +1595,7 @@
                 <w:sz w:val="20"/>
                 <w:szCs w:val="20"/>
               </w:rPr>
-              <w:t xml:space="preserve">() </w:t>
-            </w:r>
-            <w:proofErr w:type="gramStart"/>
-            <w:r>
-              <w:rPr>
-                <w:rFonts w:ascii="Abadi" w:hAnsi="Abadi"/>
-                <w:sz w:val="20"/>
-                <w:szCs w:val="20"/>
-              </w:rPr>
-              <w:t>+ .map</w:t>
-            </w:r>
-            <w:proofErr w:type="gramEnd"/>
-            <w:r>
-              <w:rPr>
-                <w:rFonts w:ascii="Abadi" w:hAnsi="Abadi"/>
-                <w:sz w:val="20"/>
-                <w:szCs w:val="20"/>
-              </w:rPr>
-              <w:t>()</w:t>
+              <w:t>() + .map()</w:t>
             </w:r>
           </w:p>
         </w:tc>
@@ -3142,71 +3088,6 @@
         <w:t xml:space="preserve"> — so the project finishes on a Thursday, not a Saturday, with two extra rest days built in naturally (the Sundays in weeks 1–4, plus Fri/Sat of week 5 free if you want a buffer for bugs or client work).</w:t>
       </w:r>
     </w:p>
-    <w:p>
-      <w:pPr>
-        <w:spacing w:after="0"/>
-        <w:rPr>
-          <w:rFonts w:ascii="Abadi" w:hAnsi="Abadi"/>
-          <w:sz w:val="20"/>
-          <w:szCs w:val="20"/>
-        </w:rPr>
-      </w:pPr>
-      <w:r>
-        <w:rPr>
-          <w:rFonts w:ascii="Abadi" w:hAnsi="Abadi"/>
-          <w:sz w:val="20"/>
-          <w:szCs w:val="20"/>
-        </w:rPr>
-        <w:lastRenderedPageBreak/>
-        <w:t xml:space="preserve">Ready to pick this up </w:t>
-      </w:r>
-      <w:proofErr w:type="gramStart"/>
-      <w:r>
-        <w:rPr>
-          <w:rFonts w:ascii="Abadi" w:hAnsi="Abadi"/>
-          <w:sz w:val="20"/>
-          <w:szCs w:val="20"/>
-        </w:rPr>
-        <w:t>at</w:t>
-      </w:r>
-      <w:proofErr w:type="gramEnd"/>
-      <w:r>
-        <w:rPr>
-          <w:rFonts w:ascii="Abadi" w:hAnsi="Abadi"/>
-          <w:sz w:val="20"/>
-          <w:szCs w:val="20"/>
-        </w:rPr>
-        <w:t xml:space="preserve"> </w:t>
-      </w:r>
-      <w:r>
-        <w:rPr>
-          <w:rFonts w:ascii="Abadi" w:hAnsi="Abadi"/>
-          <w:b/>
-          <w:bCs/>
-          <w:sz w:val="20"/>
-          <w:szCs w:val="20"/>
-        </w:rPr>
-        <w:t>Day 6</w:t>
-      </w:r>
-      <w:r>
-        <w:rPr>
-          <w:rFonts w:ascii="Abadi" w:hAnsi="Abadi"/>
-          <w:sz w:val="20"/>
-          <w:szCs w:val="20"/>
-        </w:rPr>
-        <w:t xml:space="preserve"> whenever you are.</w:t>
-      </w:r>
-    </w:p>
-    <w:p>
-      <w:pPr>
-        <w:spacing w:after="0"/>
-        <w:rPr>
-          <w:rFonts w:ascii="Abadi" w:hAnsi="Abadi"/>
-          <w:sz w:val="20"/>
-          <w:szCs w:val="20"/>
-        </w:rPr>
-      </w:pPr>
-    </w:p>
     <w:sectPr>
       <w:pgSz w:w="12240" w:h="15840"/>
       <w:pgMar w:top="1440" w:right="1440" w:bottom="1440" w:left="1440" w:header="720" w:footer="720" w:gutter="0"/>
@@ -3218,7 +3099,7 @@
 </file>
 
 <file path=word/styles.xml><?xml version="1.0" encoding="utf-8"?>
-<w:styles xmlns:mc="http://schemas.openxmlformats.org/markup-compatibility/2006" xmlns:r="http://schemas.openxmlformats.org/officeDocument/2006/relationships" xmlns:w="http://schemas.openxmlformats.org/wordprocessingml/2006/main" xmlns:w14="http://schemas.microsoft.com/office/word/2010/wordml" xmlns:w15="http://schemas.microsoft.com/office/word/2012/wordml" xmlns:w16cex="http://schemas.microsoft.com/office/word/2018/wordml/cex" xmlns:w16cid="http://schemas.microsoft.com/office/word/2016/wordml/cid" xmlns:w16="http://schemas.microsoft.com/office/word/2018/wordml" xmlns:w16du="http://schemas.microsoft.com/office/word/2023/wordml/word16du" xmlns:w16sdtdh="http://schemas.microsoft.com/office/word/2020/wordml/sdtdatahash" xmlns:w16sdtfl="http://schemas.microsoft.com/office/word/2024/wordml/sdtformatlock" xmlns:w16se="http://schemas.microsoft.com/office/word/2015/wordml/symex" mc:Ignorable="w14 w15 w16se w16cid w16 w16cex w16sdtdh w16sdtfl w16du">
+<w:styles xmlns:mc="http://schemas.openxmlformats.org/markup-compatibility/2006" xmlns:r="http://schemas.openxmlformats.org/officeDocument/2006/relationships" xmlns:w="http://schemas.openxmlformats.org/wordprocessingml/2006/main" xmlns:w14="http://schemas.microsoft.com/office/word/2010/wordml" xmlns:w15="http://schemas.microsoft.com/office/word/2012/wordml" xmlns:w16cex="http://schemas.microsoft.com/office/word/2018/wordml/cex" xmlns:w16cid="http://schemas.microsoft.com/office/word/2016/wordml/cid" xmlns:w16="http://schemas.microsoft.com/office/word/2018/wordml" xmlns:w16du="http://schemas.microsoft.com/office/word/2023/wordml/word16du" xmlns:w16sdtdh="http://schemas.microsoft.com/office/word/2020/wordml/sdtdatahash" xmlns:w16se="http://schemas.microsoft.com/office/word/2015/wordml/symex" mc:Ignorable="w14 w15 w16se w16cid w16 w16cex w16sdtdh w16du">
   <w:docDefaults>
     <w:rPrDefault>
       <w:rPr>
@@ -3820,6 +3701,7 @@
   <w:style w:type="character" w:default="1" w:styleId="DefaultParagraphFont">
     <w:name w:val="Default Paragraph Font"/>
     <w:uiPriority w:val="1"/>
+    <w:semiHidden/>
     <w:unhideWhenUsed/>
   </w:style>
   <w:style w:type="table" w:default="1" w:styleId="TableNormal">

</xml_diff>